<commit_message>
Modified the Word document content
Changed the "About this document" section heading to "Disclaimer"
Add "Any similarity to existing names or products is purely coincidental." in disclaimer.
</commit_message>
<xml_diff>
--- a/docs/Aura-Smart-Headset-V2-Sample-Product-Guide.docx
+++ b/docs/Aura-Smart-Headset-V2-Sample-Product-Guide.docx
@@ -30,7 +30,7 @@
         <w:shd w:val="clear" w:color="auto" w:fill="FAE2D5" w:themeFill="accent2" w:themeFillTint="33"/>
       </w:pPr>
       <w:r>
-        <w:t>About this Document</w:t>
+        <w:t>Disclaimer</w:t>
       </w:r>
     </w:p>
     <w:p>
@@ -44,7 +44,13 @@
         <w:rPr>
           <w:lang w:eastAsia="ja-JP"/>
         </w:rPr>
-        <w:t>This document is a speculative sample created exclusively for portfolio demonstration purposes to showcase accessible document creation. “Aura Smart Headset V2” and “Aura Audio Labs” are fictional concepts and do not represent a commercial product.</w:t>
+        <w:t xml:space="preserve">This document is a speculative sample created exclusively for portfolio demonstration purposes to showcase accessible document creation. “Aura Smart Headset V2” and “Aura Audio Labs” </w:t>
+      </w:r>
+      <w:r>
+        <w:rPr>
+          <w:lang w:eastAsia="ja-JP"/>
+        </w:rPr>
+        <w:t>are fictional concepts created for portfolio process only. Any similarity to existing names or products is purely coincidental.</w:t>
       </w:r>
     </w:p>
     <w:p>
@@ -2678,7 +2684,6 @@
   <w:style w:type="character" w:default="1" w:styleId="DefaultParagraphFont">
     <w:name w:val="Default Paragraph Font"/>
     <w:uiPriority w:val="1"/>
-    <w:semiHidden/>
     <w:unhideWhenUsed/>
   </w:style>
   <w:style w:type="table" w:default="1" w:styleId="TableNormal">

</xml_diff>